<commit_message>
docs: finalize report and Topic Classification deliverables
</commit_message>
<xml_diff>
--- a/docs/final_report.docx
+++ b/docs/final_report.docx
@@ -3828,7 +3828,7 @@
                 <w:szCs w:val="22"/>
                 <w:lang w:val="en-US" w:eastAsia="en-US" w:bidi="ar-SA"/>
               </w:rPr>
-              <w:t>0.1891</w:t>
+              <w:t>0.180748</w:t>
             </w:r>
           </w:p>
         </w:tc>
@@ -3861,7 +3861,7 @@
                 <w:szCs w:val="22"/>
                 <w:lang w:val="en-US" w:eastAsia="en-US" w:bidi="ar-SA"/>
               </w:rPr>
-              <w:t>94.58% Accuracy</w:t>
+              <w:t>94.45% Accuracy</w:t>
             </w:r>
           </w:p>
         </w:tc>
@@ -3894,7 +3894,7 @@
                 <w:szCs w:val="22"/>
                 <w:lang w:val="en-US" w:eastAsia="en-US" w:bidi="ar-SA"/>
               </w:rPr>
-              <w:t>2889.20 s</w:t>
+              <w:t>2793.66 s</w:t>
             </w:r>
           </w:p>
         </w:tc>
@@ -4210,7 +4210,6 @@
         <w:rPr>
           <w:color w:val="111111"/>
         </w:rPr>
-        <w:t>For Topic Classification, the Feature-Based method does not have a neural</w:t>
       </w:r>
     </w:p>
     <w:p>
@@ -4240,7 +4239,6 @@
         <w:rPr>
           <w:color w:val="111111"/>
         </w:rPr>
-        <w:t>the extracted embeddings. The Fine-Tuning experiment used one epoch. Its</w:t>
       </w:r>
     </w:p>
     <w:p>
@@ -4255,7 +4253,6 @@
         <w:rPr>
           <w:color w:val="111111"/>
         </w:rPr>
-        <w:t>directly observed evaluation loss was 0.171512.</w:t>
       </w:r>
     </w:p>
     <w:p>
@@ -8313,7 +8310,7 @@
                 <w:szCs w:val="22"/>
                 <w:lang w:val="en-US" w:eastAsia="en-US" w:bidi="ar-SA"/>
               </w:rPr>
-              <w:t>94.58%</w:t>
+              <w:t>94.45%</w:t>
             </w:r>
           </w:p>
         </w:tc>
@@ -8346,7 +8343,7 @@
                 <w:szCs w:val="22"/>
                 <w:lang w:val="en-US" w:eastAsia="en-US" w:bidi="ar-SA"/>
               </w:rPr>
-              <w:t>~95%</w:t>
+              <w:t>0.9444</w:t>
             </w:r>
           </w:p>
         </w:tc>
@@ -8379,7 +8376,7 @@
                 <w:szCs w:val="22"/>
                 <w:lang w:val="en-US" w:eastAsia="en-US" w:bidi="ar-SA"/>
               </w:rPr>
-              <w:t>2889.20 s</w:t>
+              <w:t>2793.66 s</w:t>
             </w:r>
           </w:p>
         </w:tc>
@@ -8410,7 +8407,7 @@
         <w:rPr>
           <w:color w:val="111111"/>
         </w:rPr>
-        <w:t>Fine-Tuning improved accuracy by approximately 4.22 percentage points and Macro F1 by approximately five percentage points.</w:t>
+        <w:t>Fine-Tuning improved accuracy by approximately 4.09 percentage points and Macro F1 by approximately 0.04.</w:t>
       </w:r>
     </w:p>
     <w:p>
@@ -8441,7 +8438,7 @@
         <w:rPr>
           <w:color w:val="111111"/>
         </w:rPr>
-        <w:t>6.5 Evaluation Limitation</w:t>
+        <w:t>6.5 Evaluation Protocol</w:t>
       </w:r>
     </w:p>
     <w:p>
@@ -8456,7 +8453,7 @@
         <w:rPr>
           <w:color w:val="111111"/>
         </w:rPr>
-        <w:t xml:space="preserve">The official AG News test split was supplied to the Hugging Face Trainer as </w:t>
+        <w:t>The original 120,000-example AG News training split was divided using a fixed seed of 42 into 108,000 training examples and 12,000 validation examples. The validation split was supplied to the Hugging Face Trainer as eval_dataset. The official 7,600-example AG News test split remained untouched throughout training and validation and was used exclusively for final evaluation. For the single fine-tuning epoch, the Trainer reported a training loss of 0.180748 and validation loss of 0.173437. Final evaluation on the official test split produced a test loss of 0.175384, 94.45% accuracy, and 0.9444 Macro F1.</w:t>
       </w:r>
       <w:r>
         <w:rPr>
@@ -8464,13 +8461,11 @@
           <w:color w:val="111111"/>
           <w:sz w:val="18"/>
         </w:rPr>
-        <w:t>eval_dataset</w:t>
-      </w:r>
-      <w:r>
-        <w:rPr>
-          <w:color w:val="111111"/>
-        </w:rPr>
-        <w:t xml:space="preserve"> during fine-tuning and was subsequently used again for final evaluation.</w:t>
+      </w:r>
+      <w:r>
+        <w:rPr>
+          <w:color w:val="111111"/>
+        </w:rPr>
       </w:r>
     </w:p>
     <w:p>
@@ -8485,7 +8480,6 @@
         <w:rPr>
           <w:color w:val="111111"/>
         </w:rPr>
-        <w:t>Therefore, unlike the NER and POS experiments, the test set was not maintained as a completely untouched final evaluation set.</w:t>
       </w:r>
     </w:p>
     <w:p>
@@ -8500,7 +8494,6 @@
         <w:rPr>
           <w:color w:val="111111"/>
         </w:rPr>
-        <w:t>This is an experimental limitation and the reported Topic Classification results should be interpreted accordingly.</w:t>
       </w:r>
     </w:p>
     <w:p>
@@ -8546,7 +8539,7 @@
         <w:rPr>
           <w:color w:val="111111"/>
         </w:rPr>
-        <w:t>At the time of report consolidation, the trained model artifact had not yet been received by the project integrator for independent Hugging Face Hub verification.</w:t>
+        <w:t>The final Topic Classification model and tokenizer are published and independently verified on Hugging Face Hub: https://huggingface.co/bialexacosta21/bert-agnews-topic-classification</w:t>
       </w:r>
     </w:p>
     <w:p>
@@ -10031,258 +10024,27 @@
       </w:r>
     </w:p>
     <w:p>
-      <w:pPr>
-        <w:pStyle w:val="Normal"/>
-        <w:jc w:val="both"/>
-        <w:rPr>
-          <w:color w:val="111111"/>
-        </w:rPr>
-      </w:pPr>
-      <w:r>
-        <w:rPr>
-          <w:color w:val="111111"/>
-        </w:rPr>
-        <w:t>Class-level results provide a measurable view of the remaining Topic</w:t>
-      </w:r>
-    </w:p>
-    <w:p>
-      <w:pPr>
-        <w:pStyle w:val="Normal"/>
-        <w:jc w:val="both"/>
-        <w:rPr>
-          <w:color w:val="111111"/>
-        </w:rPr>
-      </w:pPr>
-      <w:r>
-        <w:rPr>
-          <w:color w:val="111111"/>
-        </w:rPr>
-        <w:t>Classification errors. With Full Fine-Tuning, F1 was 0.96 for World,</w:t>
-      </w:r>
-    </w:p>
-    <w:p>
-      <w:pPr>
-        <w:pStyle w:val="Normal"/>
-        <w:jc w:val="both"/>
-        <w:rPr>
-          <w:color w:val="111111"/>
-        </w:rPr>
-      </w:pPr>
-      <w:r>
-        <w:rPr>
-          <w:color w:val="111111"/>
-        </w:rPr>
-        <w:t>0.99 for Sports, 0.92 for Business, and 0.92 for Sci/Tech. Each class</w:t>
-      </w:r>
-    </w:p>
-    <w:p>
-      <w:pPr>
-        <w:pStyle w:val="Normal"/>
-        <w:jc w:val="both"/>
-        <w:rPr>
-          <w:color w:val="111111"/>
-        </w:rPr>
-      </w:pPr>
-      <w:r>
-        <w:rPr>
-          <w:color w:val="111111"/>
-        </w:rPr>
-        <w:t>contained 1,900 test examples.</w:t>
-      </w:r>
-    </w:p>
-    <w:p>
-      <w:pPr>
-        <w:pStyle w:val="Normal"/>
-        <w:jc w:val="both"/>
-        <w:rPr>
-          <w:color w:val="111111"/>
-        </w:rPr>
-      </w:pPr>
-      <w:r>
-        <w:rPr>
-          <w:color w:val="111111"/>
-        </w:rPr>
-        <w:t>Sports obtained the highest measured class-level F1, while Business and</w:t>
-      </w:r>
-    </w:p>
-    <w:p>
-      <w:pPr>
-        <w:pStyle w:val="Normal"/>
-        <w:jc w:val="both"/>
-        <w:rPr>
-          <w:color w:val="111111"/>
-        </w:rPr>
-      </w:pPr>
-      <w:r>
-        <w:rPr>
-          <w:color w:val="111111"/>
-        </w:rPr>
-        <w:t>Sci/Tech obtained the lowest. The Feature-Based model obtained F1 values</w:t>
-      </w:r>
-    </w:p>
-    <w:p>
-      <w:pPr>
-        <w:pStyle w:val="Normal"/>
-        <w:jc w:val="both"/>
-        <w:rPr>
-          <w:color w:val="111111"/>
-        </w:rPr>
-      </w:pPr>
-      <w:r>
-        <w:rPr>
-          <w:color w:val="111111"/>
-        </w:rPr>
-        <w:t>of 0.91, 0.97, 0.86, and 0.87 for World, Sports, Business, and Sci/Tech,</w:t>
-      </w:r>
-    </w:p>
-    <w:p>
-      <w:pPr>
-        <w:pStyle w:val="Normal"/>
-        <w:jc w:val="both"/>
-        <w:rPr>
-          <w:color w:val="111111"/>
-        </w:rPr>
-      </w:pPr>
-      <w:r>
-        <w:rPr>
-          <w:color w:val="111111"/>
-        </w:rPr>
-        <w:t>respectively.</w:t>
-      </w:r>
-    </w:p>
-    <w:p>
-      <w:pPr>
-        <w:pStyle w:val="Normal"/>
-        <w:jc w:val="both"/>
-        <w:rPr>
-          <w:color w:val="111111"/>
-        </w:rPr>
-      </w:pPr>
-      <w:r>
-        <w:rPr>
-          <w:color w:val="111111"/>
-        </w:rPr>
-        <w:t>Using the rounded reported scores, Fine-Tuning improved F1 by</w:t>
-      </w:r>
-    </w:p>
-    <w:p>
-      <w:pPr>
-        <w:pStyle w:val="Normal"/>
-        <w:jc w:val="both"/>
-        <w:rPr>
-          <w:color w:val="111111"/>
-        </w:rPr>
-      </w:pPr>
-      <w:r>
-        <w:rPr>
-          <w:color w:val="111111"/>
-        </w:rPr>
-        <w:t>approximately +0.05 for World, +0.02 for Sports, +0.06 for Business,</w:t>
-      </w:r>
-    </w:p>
-    <w:p>
-      <w:pPr>
-        <w:pStyle w:val="Normal"/>
-        <w:jc w:val="both"/>
-        <w:rPr>
-          <w:color w:val="111111"/>
-        </w:rPr>
-      </w:pPr>
-      <w:r>
-        <w:rPr>
-          <w:color w:val="111111"/>
-        </w:rPr>
-        <w:t>and +0.05 for Sci/Tech. This shows that the gain from Fine-Tuning was</w:t>
-      </w:r>
-    </w:p>
-    <w:p>
-      <w:pPr>
-        <w:pStyle w:val="Normal"/>
-        <w:jc w:val="both"/>
-        <w:rPr>
-          <w:color w:val="111111"/>
-        </w:rPr>
-      </w:pPr>
-      <w:r>
-        <w:rPr>
-          <w:color w:val="111111"/>
-        </w:rPr>
-        <w:t>present across all four classes rather than being restricted to a</w:t>
-      </w:r>
-    </w:p>
-    <w:p>
-      <w:pPr>
-        <w:pStyle w:val="Normal"/>
-        <w:jc w:val="both"/>
-        <w:rPr>
-          <w:color w:val="111111"/>
-        </w:rPr>
-      </w:pPr>
-      <w:r>
-        <w:rPr>
-          <w:color w:val="111111"/>
-        </w:rPr>
-        <w:t>single category.</w:t>
-      </w:r>
-    </w:p>
-    <w:p>
-      <w:pPr>
-        <w:pStyle w:val="Normal"/>
-        <w:jc w:val="both"/>
-        <w:rPr>
-          <w:color w:val="111111"/>
-        </w:rPr>
-      </w:pPr>
-      <w:r>
-        <w:rPr>
-          <w:color w:val="111111"/>
-        </w:rPr>
-        <w:t>No confusion matrix or stored misclassified article examples are</w:t>
-      </w:r>
-    </w:p>
-    <w:p>
-      <w:pPr>
-        <w:pStyle w:val="Normal"/>
-        <w:jc w:val="both"/>
-        <w:rPr>
-          <w:color w:val="111111"/>
-        </w:rPr>
-      </w:pPr>
-      <w:r>
-        <w:rPr>
-          <w:color w:val="111111"/>
-        </w:rPr>
-        <w:t>available for this experiment. Therefore, the available evidence does</w:t>
-      </w:r>
-    </w:p>
-    <w:p>
-      <w:pPr>
-        <w:pStyle w:val="Normal"/>
-        <w:jc w:val="both"/>
-        <w:rPr>
-          <w:color w:val="111111"/>
-        </w:rPr>
-      </w:pPr>
-      <w:r>
-        <w:rPr>
-          <w:color w:val="111111"/>
-        </w:rPr>
-        <w:t>not support attributing the lower Business or Sci/Tech F1 to a specific</w:t>
-      </w:r>
-    </w:p>
-    <w:p>
-      <w:pPr>
-        <w:pStyle w:val="Normal"/>
-        <w:jc w:val="both"/>
-        <w:rPr>
-          <w:color w:val="111111"/>
-        </w:rPr>
-      </w:pPr>
-      <w:r>
-        <w:rPr>
-          <w:color w:val="111111"/>
-        </w:rPr>
-        <w:t>semantic confusion between those categories.</w:t>
+      <w:pPr/>
+      <w:r>
+        <w:t>Class-level results provide a measurable view of the remaining Topic Classification errors. With Full Fine-Tuning, F1 was 0.95 for World, 0.99 for Sports, 0.92 for Business, and 0.92 for Sci/Tech. Each class contained 1,900 test examples.</w:t>
+      </w:r>
+    </w:p>
+    <w:p>
+      <w:pPr/>
+      <w:r>
+        <w:t>Sports obtained the highest measured class-level F1, while Business and Sci/Tech obtained the lowest. The Feature-Based model obtained F1 values of 0.91, 0.97, 0.86, and 0.87 for World, Sports, Business, and Sci/Tech, respectively.</w:t>
+      </w:r>
+    </w:p>
+    <w:p>
+      <w:pPr/>
+      <w:r>
+        <w:t>Using the rounded reported scores, Fine-Tuning improved F1 by approximately +0.04 for World, +0.02 for Sports, +0.06 for Business, and +0.05 for Sci/Tech. This shows that the gain from Fine-Tuning was present across all four classes rather than being restricted to a single category.</w:t>
+      </w:r>
+    </w:p>
+    <w:p>
+      <w:pPr/>
+      <w:r>
+        <w:t>The preserved confusion matrix and error table provide direct evidence about the remaining mistakes. The final model produced 422 errors among 7,600 official test examples (5.55%). The most frequent bidirectional confusion was Business &lt;-&gt; Sci/Tech, with 135 Business-&gt;Sci/Tech cases and 86 Sci/Tech-&gt;Business cases. World &lt;-&gt; Business followed with 43 World-&gt;Business and 41 Business-&gt;World cases. Business accumulated 182 errors, whereas Sports had only 18. These counts are consistent with greater semantic overlap between business and technology reporting, although the confusion matrix alone does not establish a causal explanation for the errors.</w:t>
       </w:r>
     </w:p>
     <w:p>
@@ -10302,6 +10064,58 @@
       </w:r>
     </w:p>
     <w:p>
+      <w:pPr/>
+      <w:r>
+        <w:t>All four selected models were independently verified as available on Hugging Face Hub at the time of final consolidation:</w:t>
+      </w:r>
+    </w:p>
+    <w:p>
+      <w:pPr/>
+      <w:r>
+        <w:t>Named Entity Recognition: https://huggingface.co/jonav/bert-base-cased-ner-conll2003</w:t>
+      </w:r>
+    </w:p>
+    <w:p>
+      <w:pPr/>
+      <w:r>
+        <w:t>Part-of-Speech Tagging: https://huggingface.co/Rivaldo2309030/bert-base-cased-pos-tagging-ewt</w:t>
+      </w:r>
+    </w:p>
+    <w:p>
+      <w:pPr/>
+      <w:r>
+        <w:t>Extractive Question Answering: https://huggingface.co/RusselKuAguilar/bert-base-cased-squad-extractive-qa</w:t>
+      </w:r>
+    </w:p>
+    <w:p>
+      <w:pPr/>
+      <w:r>
+        <w:t>Topic Classification: https://huggingface.co/bialexacosta21/bert-agnews-topic-classification</w:t>
+      </w:r>
+    </w:p>
+    <w:p>
+      <w:pPr/>
+      <w:r>
+        <w:t>For all four repositories, repository accessibility, model configuration, tokenizer files, model weights, the task-appropriate Transformers architecture, and Model Card presence were independently verified.</w:t>
+      </w:r>
+    </w:p>
+    <w:p>
+      <w:pPr>
+        <w:pStyle w:val="Heading2"/>
+        <w:keepNext w:val="true"/>
+        <w:spacing w:before="200" w:after="100"/>
+        <w:rPr>
+          <w:color w:val="111111"/>
+        </w:rPr>
+      </w:pPr>
+      <w:r>
+        <w:rPr>
+          <w:color w:val="111111"/>
+        </w:rPr>
+        <w:t>9. Limitations</w:t>
+      </w:r>
+    </w:p>
+    <w:p>
       <w:pPr>
         <w:pStyle w:val="Normal"/>
         <w:jc w:val="both"/>
@@ -10313,22 +10127,7 @@
         <w:rPr>
           <w:color w:val="111111"/>
         </w:rPr>
-        <w:t>Three of the four selected models were independently verified as available</w:t>
-      </w:r>
-    </w:p>
-    <w:p>
-      <w:pPr>
-        <w:pStyle w:val="Normal"/>
-        <w:jc w:val="both"/>
-        <w:rPr>
-          <w:color w:val="111111"/>
-        </w:rPr>
-      </w:pPr>
-      <w:r>
-        <w:rPr>
-          <w:color w:val="111111"/>
-        </w:rPr>
-        <w:t>on Hugging Face Hub at the time of report consolidation:</w:t>
+        <w:t>The main limitations of the experimental study are:</w:t>
       </w:r>
     </w:p>
     <w:p>
@@ -10344,25 +10143,9 @@
       </w:pPr>
       <w:r>
         <w:rPr>
-          <w:b/>
-          <w:color w:val="111111"/>
-        </w:rPr>
-        <w:t>Named Entity Recognition:</w:t>
-      </w:r>
-    </w:p>
-    <w:p>
-      <w:pPr>
-        <w:pStyle w:val="Normal"/>
-        <w:jc w:val="both"/>
-        <w:rPr>
-          <w:color w:val="111111"/>
-        </w:rPr>
-      </w:pPr>
-      <w:r>
-        <w:rPr>
-          <w:color w:val="111111"/>
-        </w:rPr>
-        <w:t>https://huggingface.co/jonav/bert-base-cased-ner-conll2003</w:t>
+          <w:color w:val="111111"/>
+        </w:rPr>
+        <w:t>Only one random seed was evaluated per configuration.</w:t>
       </w:r>
     </w:p>
     <w:p>
@@ -10378,25 +10161,9 @@
       </w:pPr>
       <w:r>
         <w:rPr>
-          <w:b/>
-          <w:color w:val="111111"/>
-        </w:rPr>
-        <w:t>Part-of-Speech Tagging:</w:t>
-      </w:r>
-    </w:p>
-    <w:p>
-      <w:pPr>
-        <w:pStyle w:val="Normal"/>
-        <w:jc w:val="both"/>
-        <w:rPr>
-          <w:color w:val="111111"/>
-        </w:rPr>
-      </w:pPr>
-      <w:r>
-        <w:rPr>
-          <w:color w:val="111111"/>
-        </w:rPr>
-        <w:t>https://huggingface.co/Rivaldo2309030/bert-base-cased-pos-tagging-ewt</w:t>
+          <w:color w:val="111111"/>
+        </w:rPr>
+        <w:t>Hardware differed among team members.</w:t>
       </w:r>
     </w:p>
     <w:p>
@@ -10412,160 +10179,9 @@
       </w:pPr>
       <w:r>
         <w:rPr>
-          <w:b/>
-          <w:color w:val="111111"/>
-        </w:rPr>
-        <w:t>Extractive Question Answering:</w:t>
-      </w:r>
-    </w:p>
-    <w:p>
-      <w:pPr>
-        <w:pStyle w:val="Normal"/>
-        <w:jc w:val="both"/>
-        <w:rPr>
-          <w:color w:val="111111"/>
-        </w:rPr>
-      </w:pPr>
-      <w:r>
-        <w:rPr>
-          <w:color w:val="111111"/>
-        </w:rPr>
-        <w:t>https://huggingface.co/RusselKuAguilar/bert-base-cased-squad-extractive-qa</w:t>
-      </w:r>
-    </w:p>
-    <w:p>
-      <w:pPr>
-        <w:pStyle w:val="Normal"/>
-        <w:jc w:val="both"/>
-        <w:rPr>
-          <w:color w:val="111111"/>
-        </w:rPr>
-      </w:pPr>
-      <w:r>
-        <w:rPr>
-          <w:color w:val="111111"/>
-        </w:rPr>
-        <w:t>For these three repositories, the model architecture, configuration,</w:t>
-      </w:r>
-    </w:p>
-    <w:p>
-      <w:pPr>
-        <w:pStyle w:val="Normal"/>
-        <w:jc w:val="both"/>
-        <w:rPr>
-          <w:color w:val="111111"/>
-        </w:rPr>
-      </w:pPr>
-      <w:r>
-        <w:rPr>
-          <w:color w:val="111111"/>
-        </w:rPr>
-        <w:t>tokenizer, model weights, and repository accessibility were verified.</w:t>
-      </w:r>
-    </w:p>
-    <w:p>
-      <w:pPr>
-        <w:pStyle w:val="Normal"/>
-        <w:jc w:val="both"/>
-        <w:rPr>
-          <w:color w:val="111111"/>
-        </w:rPr>
-      </w:pPr>
-      <w:r>
-        <w:rPr>
-          <w:color w:val="111111"/>
-        </w:rPr>
-        <w:t>The selected Topic Classification model had been saved during the original</w:t>
-      </w:r>
-    </w:p>
-    <w:p>
-      <w:pPr>
-        <w:pStyle w:val="Normal"/>
-        <w:jc w:val="both"/>
-        <w:rPr>
-          <w:color w:val="111111"/>
-        </w:rPr>
-      </w:pPr>
-      <w:r>
-        <w:rPr>
-          <w:color w:val="111111"/>
-        </w:rPr>
-        <w:t xml:space="preserve">training session as </w:t>
-      </w:r>
-      <w:r>
-        <w:rPr>
-          <w:rFonts w:ascii="Liberation Mono" w:hAnsi="Liberation Mono"/>
-          <w:color w:val="111111"/>
-          <w:sz w:val="18"/>
-        </w:rPr>
-        <w:t>bert_agnews_final</w:t>
-      </w:r>
-      <w:r>
-        <w:rPr>
-          <w:color w:val="111111"/>
-        </w:rPr>
-        <w:t>, but its trained weights were not</w:t>
-      </w:r>
-    </w:p>
-    <w:p>
-      <w:pPr>
-        <w:pStyle w:val="Normal"/>
-        <w:jc w:val="both"/>
-        <w:rPr>
-          <w:color w:val="111111"/>
-        </w:rPr>
-      </w:pPr>
-      <w:r>
-        <w:rPr>
-          <w:color w:val="111111"/>
-        </w:rPr>
-        <w:t>present in the shared GitHub repository at consolidation time. Therefore,</w:t>
-      </w:r>
-    </w:p>
-    <w:p>
-      <w:pPr>
-        <w:pStyle w:val="Normal"/>
-        <w:jc w:val="both"/>
-        <w:rPr>
-          <w:color w:val="111111"/>
-        </w:rPr>
-      </w:pPr>
-      <w:r>
-        <w:rPr>
-          <w:color w:val="111111"/>
-        </w:rPr>
-        <w:t>its Hugging Face artifact could not yet be independently verified.</w:t>
-      </w:r>
-    </w:p>
-    <w:p>
-      <w:pPr>
-        <w:pStyle w:val="Heading2"/>
-        <w:keepNext w:val="true"/>
-        <w:spacing w:before="200" w:after="100"/>
-        <w:rPr>
-          <w:color w:val="111111"/>
-        </w:rPr>
-      </w:pPr>
-      <w:r>
-        <w:rPr>
-          <w:color w:val="111111"/>
-        </w:rPr>
-        <w:t>9. Limitations</w:t>
-      </w:r>
-    </w:p>
-    <w:p>
-      <w:pPr>
-        <w:pStyle w:val="Normal"/>
-        <w:jc w:val="both"/>
-        <w:rPr>
-          <w:color w:val="111111"/>
-        </w:rPr>
-      </w:pPr>
-      <w:r>
-        <w:rPr>
-          <w:color w:val="111111"/>
-        </w:rPr>
-        <w:t>The main limitations of the experimental study are:</w:t>
+          <w:color w:val="111111"/>
+        </w:rPr>
+        <w:t>Some configurations differed in epochs, scheduler settings, and trainable layers simultaneously.</w:t>
       </w:r>
     </w:p>
     <w:p>
@@ -10583,7 +10199,7 @@
         <w:rPr>
           <w:color w:val="111111"/>
         </w:rPr>
-        <w:t>Only one random seed was evaluated per configuration.</w:t>
+        <w:t>Training-time comparisons therefore reflect complete experimental configurations rather than perfectly controlled ablations.</w:t>
       </w:r>
     </w:p>
     <w:p>
@@ -10601,7 +10217,7 @@
         <w:rPr>
           <w:color w:val="111111"/>
         </w:rPr>
-        <w:t>Hardware differed among team members.</w:t>
+        <w:t>Topic Classification Full Fine-Tuning was run for a single epoch.</w:t>
       </w:r>
     </w:p>
     <w:p>
@@ -10619,61 +10235,7 @@
         <w:rPr>
           <w:color w:val="111111"/>
         </w:rPr>
-        <w:t>Some configurations differed in epochs, scheduler settings, and trainable layers simultaneously.</w:t>
-      </w:r>
-    </w:p>
-    <w:p>
-      <w:pPr>
-        <w:pStyle w:val="ListBullet"/>
-        <w:numPr>
-          <w:ilvl w:val="0"/>
-          <w:numId w:val="1"/>
-        </w:numPr>
-        <w:rPr>
-          <w:color w:val="111111"/>
-        </w:rPr>
-      </w:pPr>
-      <w:r>
-        <w:rPr>
-          <w:color w:val="111111"/>
-        </w:rPr>
-        <w:t>Training-time comparisons therefore reflect complete experimental configurations rather than perfectly controlled ablations.</w:t>
-      </w:r>
-    </w:p>
-    <w:p>
-      <w:pPr>
-        <w:pStyle w:val="ListBullet"/>
-        <w:numPr>
-          <w:ilvl w:val="0"/>
-          <w:numId w:val="1"/>
-        </w:numPr>
-        <w:rPr>
-          <w:color w:val="111111"/>
-        </w:rPr>
-      </w:pPr>
-      <w:r>
-        <w:rPr>
-          <w:color w:val="111111"/>
-        </w:rPr>
-        <w:t>The Topic Classification experiment did not preserve the official test split as an untouched final evaluation set.</w:t>
-      </w:r>
-    </w:p>
-    <w:p>
-      <w:pPr>
-        <w:pStyle w:val="ListBullet"/>
-        <w:numPr>
-          <w:ilvl w:val="0"/>
-          <w:numId w:val="1"/>
-        </w:numPr>
-        <w:rPr>
-          <w:color w:val="111111"/>
-        </w:rPr>
-      </w:pPr>
-      <w:r>
-        <w:rPr>
-          <w:color w:val="111111"/>
-        </w:rPr>
-        <w:t>The AG News model artifact had not yet been independently verified on Hugging Face Hub at the time of consolidation.</w:t>
+        <w:t>Topic Classification inputs were truncated to a maximum sequence length of 128 tokens.</w:t>
       </w:r>
     </w:p>
     <w:p>

</xml_diff>

<commit_message>
docs: fix author name and add report table of contents
</commit_message>
<xml_diff>
--- a/docs/final_report.docx
+++ b/docs/final_report.docx
@@ -452,7 +452,7 @@
         <w:br/>
         <w:t>Russel Emmanuel Ku Aguilar</w:t>
         <w:br/>
-        <w:t>Angel Rivaldo Canche Puc</w:t>
+        <w:t>Angel Rivaldo Canche Chuc</w:t>
         <w:br/>
         <w:t>Bianca Alexandra Acosta Castellanos</w:t>
         <w:br/>
@@ -496,99 +496,744 @@
       </w:r>
     </w:p>
     <w:p>
-      <w:pPr>
-        <w:pStyle w:val="Normal"/>
-        <w:rPr>
-          <w:color w:val="111111"/>
-          <w:sz w:val="26"/>
-          <w:szCs w:val="26"/>
-        </w:rPr>
-      </w:pPr>
-      <w:r>
-        <w:rPr>
-          <w:color w:val="111111"/>
-          <w:sz w:val="26"/>
-          <w:szCs w:val="26"/>
-        </w:rPr>
-      </w:r>
-    </w:p>
-    <w:p>
-      <w:pPr>
-        <w:pStyle w:val="Normal"/>
-        <w:rPr>
-          <w:color w:val="111111"/>
-        </w:rPr>
-      </w:pPr>
-      <w:r>
-        <w:rPr>
-          <w:color w:val="111111"/>
-        </w:rPr>
-      </w:r>
-    </w:p>
-    <w:p>
-      <w:pPr>
-        <w:pStyle w:val="Normal"/>
-        <w:rPr>
-          <w:color w:val="111111"/>
-        </w:rPr>
-      </w:pPr>
-      <w:r>
-        <w:rPr>
-          <w:color w:val="111111"/>
-        </w:rPr>
-      </w:r>
-    </w:p>
-    <w:p>
-      <w:pPr>
-        <w:pStyle w:val="Normal"/>
-        <w:rPr>
-          <w:color w:val="111111"/>
-        </w:rPr>
-      </w:pPr>
-      <w:r>
-        <w:rPr>
-          <w:color w:val="111111"/>
-        </w:rPr>
-      </w:r>
-    </w:p>
-    <w:p>
-      <w:pPr>
-        <w:pStyle w:val="Normal"/>
-        <w:rPr>
-          <w:color w:val="111111"/>
-        </w:rPr>
-      </w:pPr>
-      <w:r>
-        <w:rPr>
-          <w:color w:val="111111"/>
-        </w:rPr>
-      </w:r>
-    </w:p>
-    <w:p>
-      <w:pPr>
-        <w:pStyle w:val="Normal"/>
-        <w:rPr>
-          <w:color w:val="111111"/>
-        </w:rPr>
-      </w:pPr>
-      <w:r>
-        <w:rPr>
-          <w:color w:val="111111"/>
-        </w:rPr>
-      </w:r>
-    </w:p>
-    <w:p>
-      <w:pPr>
-        <w:pStyle w:val="Normal"/>
-        <w:rPr>
-          <w:color w:val="111111"/>
-        </w:rPr>
-      </w:pPr>
-      <w:r>
-        <w:rPr>
-          <w:color w:val="111111"/>
-        </w:rPr>
-      </w:r>
+      <w:r>
+        <w:br w:type="page"/>
+      </w:r>
+    </w:p>
+    <w:p>
+      <w:pPr>
+        <w:spacing w:after="240"/>
+        <w:jc w:val="center"/>
+      </w:pPr>
+      <w:r>
+        <w:rPr>
+          <w:b/>
+          <w:sz w:val="32"/>
+        </w:rPr>
+        <w:t>Table of Contents</w:t>
+      </w:r>
+    </w:p>
+    <w:p>
+      <w:pPr>
+        <w:tabs>
+          <w:tab w:pos="8784" w:val="right" w:leader="dot"/>
+        </w:tabs>
+        <w:spacing w:before="0" w:after="0" w:line="240" w:lineRule="auto"/>
+        <w:ind w:left="0"/>
+      </w:pPr>
+      <w:r>
+        <w:rPr>
+          <w:b/>
+          <w:sz w:val="19"/>
+        </w:rPr>
+        <w:t>1. Introduction</w:t>
+        <w:tab/>
+        <w:t>3</w:t>
+      </w:r>
+    </w:p>
+    <w:p>
+      <w:pPr>
+        <w:tabs>
+          <w:tab w:pos="8784" w:val="right" w:leader="dot"/>
+        </w:tabs>
+        <w:spacing w:before="0" w:after="0" w:line="240" w:lineRule="auto"/>
+        <w:ind w:left="0"/>
+      </w:pPr>
+      <w:r>
+        <w:rPr>
+          <w:b/>
+          <w:sz w:val="19"/>
+        </w:rPr>
+        <w:t>2. Experimental Methodology</w:t>
+        <w:tab/>
+        <w:t>3</w:t>
+      </w:r>
+    </w:p>
+    <w:p>
+      <w:pPr>
+        <w:tabs>
+          <w:tab w:pos="8784" w:val="right" w:leader="dot"/>
+        </w:tabs>
+        <w:spacing w:before="0" w:after="0" w:line="240" w:lineRule="auto"/>
+        <w:ind w:left="360"/>
+      </w:pPr>
+      <w:r>
+        <w:rPr>
+          <w:b w:val="0"/>
+          <w:sz w:val="18"/>
+        </w:rPr>
+        <w:t>2.1 Base Architecture</w:t>
+        <w:tab/>
+        <w:t>3</w:t>
+      </w:r>
+    </w:p>
+    <w:p>
+      <w:pPr>
+        <w:tabs>
+          <w:tab w:pos="8784" w:val="right" w:leader="dot"/>
+        </w:tabs>
+        <w:spacing w:before="0" w:after="0" w:line="240" w:lineRule="auto"/>
+        <w:ind w:left="360"/>
+      </w:pPr>
+      <w:r>
+        <w:rPr>
+          <w:b w:val="0"/>
+          <w:sz w:val="18"/>
+        </w:rPr>
+        <w:t>2.2 Adaptation Strategies</w:t>
+        <w:tab/>
+        <w:t>3</w:t>
+      </w:r>
+    </w:p>
+    <w:p>
+      <w:pPr>
+        <w:tabs>
+          <w:tab w:pos="8784" w:val="right" w:leader="dot"/>
+        </w:tabs>
+        <w:spacing w:before="0" w:after="0" w:line="240" w:lineRule="auto"/>
+        <w:ind w:left="360"/>
+      </w:pPr>
+      <w:r>
+        <w:rPr>
+          <w:b w:val="0"/>
+          <w:sz w:val="18"/>
+        </w:rPr>
+        <w:t>2.3 Reproducibility</w:t>
+        <w:tab/>
+        <w:t>3</w:t>
+      </w:r>
+    </w:p>
+    <w:p>
+      <w:pPr>
+        <w:tabs>
+          <w:tab w:pos="8784" w:val="right" w:leader="dot"/>
+        </w:tabs>
+        <w:spacing w:before="0" w:after="0" w:line="240" w:lineRule="auto"/>
+        <w:ind w:left="360"/>
+      </w:pPr>
+      <w:r>
+        <w:rPr>
+          <w:b w:val="0"/>
+          <w:sz w:val="18"/>
+        </w:rPr>
+        <w:t>2.4 Evaluation Metrics and Rationale</w:t>
+        <w:tab/>
+        <w:t>4</w:t>
+      </w:r>
+    </w:p>
+    <w:p>
+      <w:pPr>
+        <w:tabs>
+          <w:tab w:pos="8784" w:val="right" w:leader="dot"/>
+        </w:tabs>
+        <w:spacing w:before="0" w:after="0" w:line="240" w:lineRule="auto"/>
+        <w:ind w:left="360"/>
+      </w:pPr>
+      <w:r>
+        <w:rPr>
+          <w:b w:val="0"/>
+          <w:sz w:val="18"/>
+        </w:rPr>
+        <w:t>2.5 Training Diagnostics Summary</w:t>
+        <w:tab/>
+        <w:t>4</w:t>
+      </w:r>
+    </w:p>
+    <w:p>
+      <w:pPr>
+        <w:tabs>
+          <w:tab w:pos="8784" w:val="right" w:leader="dot"/>
+        </w:tabs>
+        <w:spacing w:before="0" w:after="0" w:line="240" w:lineRule="auto"/>
+        <w:ind w:left="0"/>
+      </w:pPr>
+      <w:r>
+        <w:rPr>
+          <w:b/>
+          <w:sz w:val="19"/>
+        </w:rPr>
+        <w:t>3. Named Entity Recognition</w:t>
+        <w:tab/>
+        <w:t>6</w:t>
+      </w:r>
+    </w:p>
+    <w:p>
+      <w:pPr>
+        <w:tabs>
+          <w:tab w:pos="8784" w:val="right" w:leader="dot"/>
+        </w:tabs>
+        <w:spacing w:before="0" w:after="0" w:line="240" w:lineRule="auto"/>
+        <w:ind w:left="360"/>
+      </w:pPr>
+      <w:r>
+        <w:rPr>
+          <w:b w:val="0"/>
+          <w:sz w:val="18"/>
+        </w:rPr>
+        <w:t>3.1 Task and Dataset</w:t>
+        <w:tab/>
+        <w:t>6</w:t>
+      </w:r>
+    </w:p>
+    <w:p>
+      <w:pPr>
+        <w:tabs>
+          <w:tab w:pos="8784" w:val="right" w:leader="dot"/>
+        </w:tabs>
+        <w:spacing w:before="0" w:after="0" w:line="240" w:lineRule="auto"/>
+        <w:ind w:left="360"/>
+      </w:pPr>
+      <w:r>
+        <w:rPr>
+          <w:b w:val="0"/>
+          <w:sz w:val="18"/>
+        </w:rPr>
+        <w:t>3.2 Compared Methods</w:t>
+        <w:tab/>
+        <w:t>6</w:t>
+      </w:r>
+    </w:p>
+    <w:p>
+      <w:pPr>
+        <w:tabs>
+          <w:tab w:pos="8784" w:val="right" w:leader="dot"/>
+        </w:tabs>
+        <w:spacing w:before="0" w:after="0" w:line="240" w:lineRule="auto"/>
+        <w:ind w:left="360"/>
+      </w:pPr>
+      <w:r>
+        <w:rPr>
+          <w:b w:val="0"/>
+          <w:sz w:val="18"/>
+        </w:rPr>
+        <w:t>3.3 Results</w:t>
+        <w:tab/>
+        <w:t>6</w:t>
+      </w:r>
+    </w:p>
+    <w:p>
+      <w:pPr>
+        <w:tabs>
+          <w:tab w:pos="8784" w:val="right" w:leader="dot"/>
+        </w:tabs>
+        <w:spacing w:before="0" w:after="0" w:line="240" w:lineRule="auto"/>
+        <w:ind w:left="360"/>
+      </w:pPr>
+      <w:r>
+        <w:rPr>
+          <w:b w:val="0"/>
+          <w:sz w:val="18"/>
+        </w:rPr>
+        <w:t>3.4 Selected Model</w:t>
+        <w:tab/>
+        <w:t>6</w:t>
+      </w:r>
+    </w:p>
+    <w:p>
+      <w:pPr>
+        <w:tabs>
+          <w:tab w:pos="8784" w:val="right" w:leader="dot"/>
+        </w:tabs>
+        <w:spacing w:before="0" w:after="0" w:line="240" w:lineRule="auto"/>
+        <w:ind w:left="0"/>
+      </w:pPr>
+      <w:r>
+        <w:rPr>
+          <w:b/>
+          <w:sz w:val="19"/>
+        </w:rPr>
+        <w:t>4. Part-of-Speech Tagging</w:t>
+        <w:tab/>
+        <w:t>7</w:t>
+      </w:r>
+    </w:p>
+    <w:p>
+      <w:pPr>
+        <w:tabs>
+          <w:tab w:pos="8784" w:val="right" w:leader="dot"/>
+        </w:tabs>
+        <w:spacing w:before="0" w:after="0" w:line="240" w:lineRule="auto"/>
+        <w:ind w:left="360"/>
+      </w:pPr>
+      <w:r>
+        <w:rPr>
+          <w:b w:val="0"/>
+          <w:sz w:val="18"/>
+        </w:rPr>
+        <w:t>4.1 Task and Dataset</w:t>
+        <w:tab/>
+        <w:t>7</w:t>
+      </w:r>
+    </w:p>
+    <w:p>
+      <w:pPr>
+        <w:tabs>
+          <w:tab w:pos="8784" w:val="right" w:leader="dot"/>
+        </w:tabs>
+        <w:spacing w:before="0" w:after="0" w:line="240" w:lineRule="auto"/>
+        <w:ind w:left="360"/>
+      </w:pPr>
+      <w:r>
+        <w:rPr>
+          <w:b w:val="0"/>
+          <w:sz w:val="18"/>
+        </w:rPr>
+        <w:t>4.2 Compared Methods</w:t>
+        <w:tab/>
+        <w:t>7</w:t>
+      </w:r>
+    </w:p>
+    <w:p>
+      <w:pPr>
+        <w:tabs>
+          <w:tab w:pos="8784" w:val="right" w:leader="dot"/>
+        </w:tabs>
+        <w:spacing w:before="0" w:after="0" w:line="240" w:lineRule="auto"/>
+        <w:ind w:left="360"/>
+      </w:pPr>
+      <w:r>
+        <w:rPr>
+          <w:b w:val="0"/>
+          <w:sz w:val="18"/>
+        </w:rPr>
+        <w:t>4.3 Results</w:t>
+        <w:tab/>
+        <w:t>7</w:t>
+      </w:r>
+    </w:p>
+    <w:p>
+      <w:pPr>
+        <w:tabs>
+          <w:tab w:pos="8784" w:val="right" w:leader="dot"/>
+        </w:tabs>
+        <w:spacing w:before="0" w:after="0" w:line="240" w:lineRule="auto"/>
+        <w:ind w:left="360"/>
+      </w:pPr>
+      <w:r>
+        <w:rPr>
+          <w:b w:val="0"/>
+          <w:sz w:val="18"/>
+        </w:rPr>
+        <w:t>4.4 Interpretation</w:t>
+        <w:tab/>
+        <w:t>7</w:t>
+      </w:r>
+    </w:p>
+    <w:p>
+      <w:pPr>
+        <w:tabs>
+          <w:tab w:pos="8784" w:val="right" w:leader="dot"/>
+        </w:tabs>
+        <w:spacing w:before="0" w:after="0" w:line="240" w:lineRule="auto"/>
+        <w:ind w:left="360"/>
+      </w:pPr>
+      <w:r>
+        <w:rPr>
+          <w:b w:val="0"/>
+          <w:sz w:val="18"/>
+        </w:rPr>
+        <w:t>4.5 Selected Model</w:t>
+        <w:tab/>
+        <w:t>8</w:t>
+      </w:r>
+    </w:p>
+    <w:p>
+      <w:pPr>
+        <w:tabs>
+          <w:tab w:pos="8784" w:val="right" w:leader="dot"/>
+        </w:tabs>
+        <w:spacing w:before="0" w:after="0" w:line="240" w:lineRule="auto"/>
+        <w:ind w:left="0"/>
+      </w:pPr>
+      <w:r>
+        <w:rPr>
+          <w:b/>
+          <w:sz w:val="19"/>
+        </w:rPr>
+        <w:t>5. Extractive Question Answering</w:t>
+        <w:tab/>
+        <w:t>8</w:t>
+      </w:r>
+    </w:p>
+    <w:p>
+      <w:pPr>
+        <w:tabs>
+          <w:tab w:pos="8784" w:val="right" w:leader="dot"/>
+        </w:tabs>
+        <w:spacing w:before="0" w:after="0" w:line="240" w:lineRule="auto"/>
+        <w:ind w:left="360"/>
+      </w:pPr>
+      <w:r>
+        <w:rPr>
+          <w:b w:val="0"/>
+          <w:sz w:val="18"/>
+        </w:rPr>
+        <w:t>5.1 Task and Dataset</w:t>
+        <w:tab/>
+        <w:t>8</w:t>
+      </w:r>
+    </w:p>
+    <w:p>
+      <w:pPr>
+        <w:tabs>
+          <w:tab w:pos="8784" w:val="right" w:leader="dot"/>
+        </w:tabs>
+        <w:spacing w:before="0" w:after="0" w:line="240" w:lineRule="auto"/>
+        <w:ind w:left="360"/>
+      </w:pPr>
+      <w:r>
+        <w:rPr>
+          <w:b w:val="0"/>
+          <w:sz w:val="18"/>
+        </w:rPr>
+        <w:t>5.2 Compared Methods</w:t>
+        <w:tab/>
+        <w:t>8</w:t>
+      </w:r>
+    </w:p>
+    <w:p>
+      <w:pPr>
+        <w:tabs>
+          <w:tab w:pos="8784" w:val="right" w:leader="dot"/>
+        </w:tabs>
+        <w:spacing w:before="0" w:after="0" w:line="240" w:lineRule="auto"/>
+        <w:ind w:left="360"/>
+      </w:pPr>
+      <w:r>
+        <w:rPr>
+          <w:b w:val="0"/>
+          <w:sz w:val="18"/>
+        </w:rPr>
+        <w:t>5.3 Results</w:t>
+        <w:tab/>
+        <w:t>8</w:t>
+      </w:r>
+    </w:p>
+    <w:p>
+      <w:pPr>
+        <w:tabs>
+          <w:tab w:pos="8784" w:val="right" w:leader="dot"/>
+        </w:tabs>
+        <w:spacing w:before="0" w:after="0" w:line="240" w:lineRule="auto"/>
+        <w:ind w:left="360"/>
+      </w:pPr>
+      <w:r>
+        <w:rPr>
+          <w:b w:val="0"/>
+          <w:sz w:val="18"/>
+        </w:rPr>
+        <w:t>5.4 Dataset Scale</w:t>
+        <w:tab/>
+        <w:t>9</w:t>
+      </w:r>
+    </w:p>
+    <w:p>
+      <w:pPr>
+        <w:tabs>
+          <w:tab w:pos="8784" w:val="right" w:leader="dot"/>
+        </w:tabs>
+        <w:spacing w:before="0" w:after="0" w:line="240" w:lineRule="auto"/>
+        <w:ind w:left="360"/>
+      </w:pPr>
+      <w:r>
+        <w:rPr>
+          <w:b w:val="0"/>
+          <w:sz w:val="18"/>
+        </w:rPr>
+        <w:t>5.5 Selected Model</w:t>
+        <w:tab/>
+        <w:t>9</w:t>
+      </w:r>
+    </w:p>
+    <w:p>
+      <w:pPr>
+        <w:tabs>
+          <w:tab w:pos="8784" w:val="right" w:leader="dot"/>
+        </w:tabs>
+        <w:spacing w:before="0" w:after="0" w:line="240" w:lineRule="auto"/>
+        <w:ind w:left="0"/>
+      </w:pPr>
+      <w:r>
+        <w:rPr>
+          <w:b/>
+          <w:sz w:val="19"/>
+        </w:rPr>
+        <w:t>6. Topic Classification</w:t>
+        <w:tab/>
+        <w:t>9</w:t>
+      </w:r>
+    </w:p>
+    <w:p>
+      <w:pPr>
+        <w:tabs>
+          <w:tab w:pos="8784" w:val="right" w:leader="dot"/>
+        </w:tabs>
+        <w:spacing w:before="0" w:after="0" w:line="240" w:lineRule="auto"/>
+        <w:ind w:left="360"/>
+      </w:pPr>
+      <w:r>
+        <w:rPr>
+          <w:b w:val="0"/>
+          <w:sz w:val="18"/>
+        </w:rPr>
+        <w:t>6.1 Task and Dataset</w:t>
+        <w:tab/>
+        <w:t>9</w:t>
+      </w:r>
+    </w:p>
+    <w:p>
+      <w:pPr>
+        <w:tabs>
+          <w:tab w:pos="8784" w:val="right" w:leader="dot"/>
+        </w:tabs>
+        <w:spacing w:before="0" w:after="0" w:line="240" w:lineRule="auto"/>
+        <w:ind w:left="360"/>
+      </w:pPr>
+      <w:r>
+        <w:rPr>
+          <w:b w:val="0"/>
+          <w:sz w:val="18"/>
+        </w:rPr>
+        <w:t>6.2 Feature-Based Adaptation</w:t>
+        <w:tab/>
+        <w:t>10</w:t>
+      </w:r>
+    </w:p>
+    <w:p>
+      <w:pPr>
+        <w:tabs>
+          <w:tab w:pos="8784" w:val="right" w:leader="dot"/>
+        </w:tabs>
+        <w:spacing w:before="0" w:after="0" w:line="240" w:lineRule="auto"/>
+        <w:ind w:left="360"/>
+      </w:pPr>
+      <w:r>
+        <w:rPr>
+          <w:b w:val="0"/>
+          <w:sz w:val="18"/>
+        </w:rPr>
+        <w:t>6.3 Full Fine-Tuning</w:t>
+        <w:tab/>
+        <w:t>10</w:t>
+      </w:r>
+    </w:p>
+    <w:p>
+      <w:pPr>
+        <w:tabs>
+          <w:tab w:pos="8784" w:val="right" w:leader="dot"/>
+        </w:tabs>
+        <w:spacing w:before="0" w:after="0" w:line="240" w:lineRule="auto"/>
+        <w:ind w:left="360"/>
+      </w:pPr>
+      <w:r>
+        <w:rPr>
+          <w:b w:val="0"/>
+          <w:sz w:val="18"/>
+        </w:rPr>
+        <w:t>6.4 Results</w:t>
+        <w:tab/>
+        <w:t>10</w:t>
+      </w:r>
+    </w:p>
+    <w:p>
+      <w:pPr>
+        <w:tabs>
+          <w:tab w:pos="8784" w:val="right" w:leader="dot"/>
+        </w:tabs>
+        <w:spacing w:before="0" w:after="0" w:line="240" w:lineRule="auto"/>
+        <w:ind w:left="360"/>
+      </w:pPr>
+      <w:r>
+        <w:rPr>
+          <w:b w:val="0"/>
+          <w:sz w:val="18"/>
+        </w:rPr>
+        <w:t>6.5 Evaluation Protocol</w:t>
+        <w:tab/>
+        <w:t>10</w:t>
+      </w:r>
+    </w:p>
+    <w:p>
+      <w:pPr>
+        <w:tabs>
+          <w:tab w:pos="8784" w:val="right" w:leader="dot"/>
+        </w:tabs>
+        <w:spacing w:before="0" w:after="0" w:line="240" w:lineRule="auto"/>
+        <w:ind w:left="360"/>
+      </w:pPr>
+      <w:r>
+        <w:rPr>
+          <w:b w:val="0"/>
+          <w:sz w:val="18"/>
+        </w:rPr>
+        <w:t>6.6 Selected Model</w:t>
+        <w:tab/>
+        <w:t>10</w:t>
+      </w:r>
+    </w:p>
+    <w:p>
+      <w:pPr>
+        <w:tabs>
+          <w:tab w:pos="8784" w:val="right" w:leader="dot"/>
+        </w:tabs>
+        <w:spacing w:before="0" w:after="0" w:line="240" w:lineRule="auto"/>
+        <w:ind w:left="0"/>
+      </w:pPr>
+      <w:r>
+        <w:rPr>
+          <w:b/>
+          <w:sz w:val="19"/>
+        </w:rPr>
+        <w:t>7. Cross-Task Comparison</w:t>
+        <w:tab/>
+        <w:t>11</w:t>
+      </w:r>
+    </w:p>
+    <w:p>
+      <w:pPr>
+        <w:tabs>
+          <w:tab w:pos="8784" w:val="right" w:leader="dot"/>
+        </w:tabs>
+        <w:spacing w:before="0" w:after="0" w:line="240" w:lineRule="auto"/>
+        <w:ind w:left="0"/>
+      </w:pPr>
+      <w:r>
+        <w:rPr>
+          <w:b/>
+          <w:sz w:val="19"/>
+        </w:rPr>
+        <w:t>8. Error Analysis</w:t>
+        <w:tab/>
+        <w:t>11</w:t>
+      </w:r>
+    </w:p>
+    <w:p>
+      <w:pPr>
+        <w:tabs>
+          <w:tab w:pos="8784" w:val="right" w:leader="dot"/>
+        </w:tabs>
+        <w:spacing w:before="0" w:after="0" w:line="240" w:lineRule="auto"/>
+        <w:ind w:left="360"/>
+      </w:pPr>
+      <w:r>
+        <w:rPr>
+          <w:b w:val="0"/>
+          <w:sz w:val="18"/>
+        </w:rPr>
+        <w:t>8.1 Named Entity Recognition</w:t>
+        <w:tab/>
+        <w:t>11</w:t>
+      </w:r>
+    </w:p>
+    <w:p>
+      <w:pPr>
+        <w:tabs>
+          <w:tab w:pos="8784" w:val="right" w:leader="dot"/>
+        </w:tabs>
+        <w:spacing w:before="0" w:after="0" w:line="240" w:lineRule="auto"/>
+        <w:ind w:left="360"/>
+      </w:pPr>
+      <w:r>
+        <w:rPr>
+          <w:b w:val="0"/>
+          <w:sz w:val="18"/>
+        </w:rPr>
+        <w:t>8.2 Part-of-Speech Tagging</w:t>
+        <w:tab/>
+        <w:t>11</w:t>
+      </w:r>
+    </w:p>
+    <w:p>
+      <w:pPr>
+        <w:tabs>
+          <w:tab w:pos="8784" w:val="right" w:leader="dot"/>
+        </w:tabs>
+        <w:spacing w:before="0" w:after="0" w:line="240" w:lineRule="auto"/>
+        <w:ind w:left="360"/>
+      </w:pPr>
+      <w:r>
+        <w:rPr>
+          <w:b w:val="0"/>
+          <w:sz w:val="18"/>
+        </w:rPr>
+        <w:t>8.3 Topic Classification</w:t>
+        <w:tab/>
+        <w:t>12</w:t>
+      </w:r>
+    </w:p>
+    <w:p>
+      <w:pPr>
+        <w:tabs>
+          <w:tab w:pos="8784" w:val="right" w:leader="dot"/>
+        </w:tabs>
+        <w:spacing w:before="0" w:after="0" w:line="240" w:lineRule="auto"/>
+        <w:ind w:left="0"/>
+      </w:pPr>
+      <w:r>
+        <w:rPr>
+          <w:b/>
+          <w:sz w:val="19"/>
+        </w:rPr>
+        <w:t>8.4 Published Model Artifacts</w:t>
+        <w:tab/>
+        <w:t>12</w:t>
+      </w:r>
+    </w:p>
+    <w:p>
+      <w:pPr>
+        <w:tabs>
+          <w:tab w:pos="8784" w:val="right" w:leader="dot"/>
+        </w:tabs>
+        <w:spacing w:before="0" w:after="0" w:line="240" w:lineRule="auto"/>
+        <w:ind w:left="0"/>
+      </w:pPr>
+      <w:r>
+        <w:rPr>
+          <w:b/>
+          <w:sz w:val="19"/>
+        </w:rPr>
+        <w:t>9. Limitations</w:t>
+        <w:tab/>
+        <w:t>12</w:t>
+      </w:r>
+    </w:p>
+    <w:p>
+      <w:pPr>
+        <w:tabs>
+          <w:tab w:pos="8784" w:val="right" w:leader="dot"/>
+        </w:tabs>
+        <w:spacing w:before="0" w:after="0" w:line="240" w:lineRule="auto"/>
+        <w:ind w:left="0"/>
+      </w:pPr>
+      <w:r>
+        <w:rPr>
+          <w:b/>
+          <w:sz w:val="19"/>
+        </w:rPr>
+        <w:t>10. Conclusions</w:t>
+        <w:tab/>
+        <w:t>13</w:t>
+      </w:r>
+    </w:p>
+    <w:p>
+      <w:pPr>
+        <w:tabs>
+          <w:tab w:pos="8784" w:val="right" w:leader="dot"/>
+        </w:tabs>
+        <w:spacing w:before="0" w:after="0" w:line="240" w:lineRule="auto"/>
+        <w:ind w:left="0"/>
+      </w:pPr>
+      <w:r>
+        <w:rPr>
+          <w:b/>
+          <w:sz w:val="19"/>
+        </w:rPr>
+        <w:t>11. References</w:t>
+        <w:tab/>
+        <w:t>13</w:t>
+      </w:r>
+    </w:p>
+    <w:p>
       <w:r>
         <w:br w:type="page"/>
       </w:r>

</xml_diff>